<commit_message>
General module: Accessible PDFs title, presenting covers screen shares and demos, help-desk contact
Co-Authored-By: Claude Sonnet 5.5 <noreply@anthropic.com>
</commit_message>
<xml_diff>
--- a/modules/general-accessibility/resources/accessibility-basics-quick-reference.docx
+++ b/modules/general-accessibility/resources/accessibility-basics-quick-reference.docx
@@ -455,7 +455,7 @@
         <w:spacing w:after="30"/>
       </w:pPr>
       <w:r>
-        <w:t xml:space="preserve">Describe what is on screen out loud, including key text. Say "next slide" as you move on.</w:t>
+        <w:t xml:space="preserve">Slides, a screen share, or a demo: describe what is on screen out loud, including key text and what you click. Say "next slide" as you move on.</w:t>
       </w:r>
     </w:p>
     <w:p>
@@ -511,6 +511,30 @@
       </w:pPr>
       <w:r>
         <w:t xml:space="preserve">Run the Accessibility Checker, then check by hand: the Navigation Pane shows your headings, Read Aloud plays the page, and zooming to 200 percent should still be readable.</w:t>
+      </w:r>
+    </w:p>
+    <w:p>
+      <w:pPr>
+        <w:pStyle w:val="ListParagraph"/>
+        <w:numPr>
+          <w:ilvl w:val="0"/>
+          <w:numId w:val="2"/>
+        </w:numPr>
+        <w:spacing w:after="30"/>
+      </w:pPr>
+      <w:r>
+        <w:t xml:space="preserve">Want a review? Email </w:t>
+      </w:r>
+      <w:hyperlink w:history="1" r:id="rIdzdwvup_0cxkmjtl_wng6a">
+        <w:r>
+          <w:rPr>
+            <w:rStyle w:val="Hyperlink"/>
+          </w:rPr>
+          <w:t xml:space="preserve">accessibilityhelpdesk@benetech.org</w:t>
+        </w:r>
+      </w:hyperlink>
+      <w:r>
+        <w:t xml:space="preserve"> to have your document checked for accessibility.</w:t>
       </w:r>
     </w:p>
     <w:sectPr>

</xml_diff>

<commit_message>
Email screen: describe attached images in the email, and prefer inline images with alt text
Co-Authored-By: Claude Sonnet 5.5 <noreply@anthropic.com>
</commit_message>
<xml_diff>
--- a/modules/general-accessibility/resources/accessibility-basics-quick-reference.docx
+++ b/modules/general-accessibility/resources/accessibility-basics-quick-reference.docx
@@ -303,7 +303,7 @@
         <w:spacing w:after="30"/>
       </w:pPr>
       <w:r>
-        <w:t xml:space="preserve">An image in an email gets alt text, and its information is also written as text. Signature contact details are text.</w:t>
+        <w:t xml:space="preserve">An attached image does not carry its alt text, so describe it in the email itself. Better, insert images inline and add the alt text there. Signature contact details are text.</w:t>
       </w:r>
     </w:p>
     <w:p>
@@ -525,7 +525,7 @@
       <w:r>
         <w:t xml:space="preserve">Want a review? Email </w:t>
       </w:r>
-      <w:hyperlink w:history="1" r:id="rIdzdwvup_0cxkmjtl_wng6a">
+      <w:hyperlink w:history="1" r:id="rIdkpfhd_s4qysho7avsov5w">
         <w:r>
           <w:rPr>
             <w:rStyle w:val="Hyperlink"/>

</xml_diff>

<commit_message>
Take-home: add the contrast checker URL to the Color and contrast section
Co-Authored-By: Claude Sonnet 5.5 <noreply@anthropic.com>
</commit_message>
<xml_diff>
--- a/modules/general-accessibility/resources/accessibility-basics-quick-reference.docx
+++ b/modules/general-accessibility/resources/accessibility-basics-quick-reference.docx
@@ -225,6 +225,27 @@
     </w:p>
     <w:p>
       <w:pPr>
+        <w:pStyle w:val="ListParagraph"/>
+        <w:numPr>
+          <w:ilvl w:val="0"/>
+          <w:numId w:val="2"/>
+        </w:numPr>
+        <w:spacing w:after="30"/>
+      </w:pPr>
+      <w:r>
+        <w:t xml:space="preserve">Check a pairing with TPGi's Colour Contrast Analyser: </w:t>
+      </w:r>
+      <w:hyperlink w:history="1" r:id="rIdcfrhmr9c4m6j2denm1gzx">
+        <w:r>
+          <w:rPr>
+            <w:rStyle w:val="Hyperlink"/>
+          </w:rPr>
+          <w:t xml:space="preserve">https://www.tpgi.com/color-contrast-checker/</w:t>
+        </w:r>
+      </w:hyperlink>
+    </w:p>
+    <w:p>
+      <w:pPr>
         <w:pStyle w:val="Heading2"/>
         <w:spacing w:after="40" w:before="140"/>
       </w:pPr>
@@ -525,7 +546,7 @@
       <w:r>
         <w:t xml:space="preserve">Want a review? Email </w:t>
       </w:r>
-      <w:hyperlink w:history="1" r:id="rIdkpfhd_s4qysho7avsov5w">
+      <w:hyperlink w:history="1" r:id="rId75asj5bsdpcm5lnh-exuc">
         <w:r>
           <w:rPr>
             <w:rStyle w:val="Hyperlink"/>

</xml_diff>